<commit_message>
Documento v1 (c/Capitulo 1 terminado)
</commit_message>
<xml_diff>
--- a/DATID_Guia_de_reporte_de_estadia_MA_2025 (1).docx
+++ b/DATID_Guia_de_reporte_de_estadia_MA_2025 (1).docx
@@ -1309,7 +1309,7 @@
         </w:rPr>
         <w:fldChar w:fldCharType="separate"/>
       </w:r>
-      <w:hyperlink w:anchor="_Toc219753867" w:history="1">
+      <w:hyperlink w:anchor="_Toc220097972" w:history="1">
         <w:r>
           <w:rPr>
             <w:rStyle w:val="Hipervnculo"/>
@@ -1336,7 +1336,7 @@
             <w:noProof/>
             <w:webHidden/>
           </w:rPr>
-          <w:instrText xml:space="preserve"> PAGEREF _Toc219753867 \h </w:instrText>
+          <w:instrText xml:space="preserve"> PAGEREF _Toc220097972 \h </w:instrText>
         </w:r>
         <w:r>
           <w:rPr>
@@ -1382,7 +1382,7 @@
           <w14:ligatures w14:val="standardContextual"/>
         </w:rPr>
       </w:pPr>
-      <w:hyperlink w:anchor="_Toc219753868" w:history="1">
+      <w:hyperlink w:anchor="_Toc220097973" w:history="1">
         <w:r>
           <w:rPr>
             <w:rStyle w:val="Hipervnculo"/>
@@ -1409,7 +1409,7 @@
             <w:noProof/>
             <w:webHidden/>
           </w:rPr>
-          <w:instrText xml:space="preserve"> PAGEREF _Toc219753868 \h </w:instrText>
+          <w:instrText xml:space="preserve"> PAGEREF _Toc220097973 \h </w:instrText>
         </w:r>
         <w:r>
           <w:rPr>
@@ -1455,7 +1455,7 @@
           <w14:ligatures w14:val="standardContextual"/>
         </w:rPr>
       </w:pPr>
-      <w:hyperlink w:anchor="_Toc219753869" w:history="1">
+      <w:hyperlink w:anchor="_Toc220097974" w:history="1">
         <w:r>
           <w:rPr>
             <w:rStyle w:val="Hipervnculo"/>
@@ -1482,7 +1482,7 @@
             <w:noProof/>
             <w:webHidden/>
           </w:rPr>
-          <w:instrText xml:space="preserve"> PAGEREF _Toc219753869 \h </w:instrText>
+          <w:instrText xml:space="preserve"> PAGEREF _Toc220097974 \h </w:instrText>
         </w:r>
         <w:r>
           <w:rPr>
@@ -1502,7 +1502,7 @@
             <w:noProof/>
             <w:webHidden/>
           </w:rPr>
-          <w:t>10</w:t>
+          <w:t>9</w:t>
         </w:r>
         <w:r>
           <w:rPr>
@@ -1528,7 +1528,7 @@
           <w14:ligatures w14:val="standardContextual"/>
         </w:rPr>
       </w:pPr>
-      <w:hyperlink w:anchor="_Toc219753870" w:history="1">
+      <w:hyperlink w:anchor="_Toc220097975" w:history="1">
         <w:r>
           <w:rPr>
             <w:rStyle w:val="Hipervnculo"/>
@@ -1555,7 +1555,7 @@
             <w:noProof/>
             <w:webHidden/>
           </w:rPr>
-          <w:instrText xml:space="preserve"> PAGEREF _Toc219753870 \h </w:instrText>
+          <w:instrText xml:space="preserve"> PAGEREF _Toc220097975 \h </w:instrText>
         </w:r>
         <w:r>
           <w:rPr>
@@ -1575,7 +1575,7 @@
             <w:noProof/>
             <w:webHidden/>
           </w:rPr>
-          <w:t>10</w:t>
+          <w:t>9</w:t>
         </w:r>
         <w:r>
           <w:rPr>
@@ -1601,7 +1601,7 @@
           <w14:ligatures w14:val="standardContextual"/>
         </w:rPr>
       </w:pPr>
-      <w:hyperlink w:anchor="_Toc219753871" w:history="1">
+      <w:hyperlink w:anchor="_Toc220097976" w:history="1">
         <w:r>
           <w:rPr>
             <w:rStyle w:val="Hipervnculo"/>
@@ -1628,7 +1628,7 @@
             <w:noProof/>
             <w:webHidden/>
           </w:rPr>
-          <w:instrText xml:space="preserve"> PAGEREF _Toc219753871 \h </w:instrText>
+          <w:instrText xml:space="preserve"> PAGEREF _Toc220097976 \h </w:instrText>
         </w:r>
         <w:r>
           <w:rPr>
@@ -1674,7 +1674,7 @@
           <w14:ligatures w14:val="standardContextual"/>
         </w:rPr>
       </w:pPr>
-      <w:hyperlink w:anchor="_Toc219753872" w:history="1">
+      <w:hyperlink w:anchor="_Toc220097977" w:history="1">
         <w:r>
           <w:rPr>
             <w:rStyle w:val="Hipervnculo"/>
@@ -1701,7 +1701,7 @@
             <w:noProof/>
             <w:webHidden/>
           </w:rPr>
-          <w:instrText xml:space="preserve"> PAGEREF _Toc219753872 \h </w:instrText>
+          <w:instrText xml:space="preserve"> PAGEREF _Toc220097977 \h </w:instrText>
         </w:r>
         <w:r>
           <w:rPr>
@@ -1747,7 +1747,7 @@
           <w14:ligatures w14:val="standardContextual"/>
         </w:rPr>
       </w:pPr>
-      <w:hyperlink w:anchor="_Toc219753873" w:history="1">
+      <w:hyperlink w:anchor="_Toc220097978" w:history="1">
         <w:r>
           <w:rPr>
             <w:rStyle w:val="Hipervnculo"/>
@@ -1774,7 +1774,7 @@
             <w:noProof/>
             <w:webHidden/>
           </w:rPr>
-          <w:instrText xml:space="preserve"> PAGEREF _Toc219753873 \h </w:instrText>
+          <w:instrText xml:space="preserve"> PAGEREF _Toc220097978 \h </w:instrText>
         </w:r>
         <w:r>
           <w:rPr>
@@ -1794,7 +1794,7 @@
             <w:noProof/>
             <w:webHidden/>
           </w:rPr>
-          <w:t>10</w:t>
+          <w:t>11</w:t>
         </w:r>
         <w:r>
           <w:rPr>
@@ -1820,7 +1820,7 @@
           <w14:ligatures w14:val="standardContextual"/>
         </w:rPr>
       </w:pPr>
-      <w:hyperlink w:anchor="_Toc219753874" w:history="1">
+      <w:hyperlink w:anchor="_Toc220097979" w:history="1">
         <w:r>
           <w:rPr>
             <w:rStyle w:val="Hipervnculo"/>
@@ -1847,7 +1847,7 @@
             <w:noProof/>
             <w:webHidden/>
           </w:rPr>
-          <w:instrText xml:space="preserve"> PAGEREF _Toc219753874 \h </w:instrText>
+          <w:instrText xml:space="preserve"> PAGEREF _Toc220097979 \h </w:instrText>
         </w:r>
         <w:r>
           <w:rPr>
@@ -1867,7 +1867,7 @@
             <w:noProof/>
             <w:webHidden/>
           </w:rPr>
-          <w:t>10</w:t>
+          <w:t>11</w:t>
         </w:r>
         <w:r>
           <w:rPr>
@@ -1895,7 +1895,7 @@
           <w14:ligatures w14:val="standardContextual"/>
         </w:rPr>
       </w:pPr>
-      <w:hyperlink w:anchor="_Toc219753875" w:history="1">
+      <w:hyperlink w:anchor="_Toc220097980" w:history="1">
         <w:r>
           <w:rPr>
             <w:rStyle w:val="Hipervnculo"/>
@@ -1922,7 +1922,7 @@
             <w:noProof/>
             <w:webHidden/>
           </w:rPr>
-          <w:instrText xml:space="preserve"> PAGEREF _Toc219753875 \h </w:instrText>
+          <w:instrText xml:space="preserve"> PAGEREF _Toc220097980 \h </w:instrText>
         </w:r>
         <w:r>
           <w:rPr>
@@ -1942,7 +1942,7 @@
             <w:noProof/>
             <w:webHidden/>
           </w:rPr>
-          <w:t>11</w:t>
+          <w:t>12</w:t>
         </w:r>
         <w:r>
           <w:rPr>
@@ -1968,7 +1968,7 @@
           <w14:ligatures w14:val="standardContextual"/>
         </w:rPr>
       </w:pPr>
-      <w:hyperlink w:anchor="_Toc219753876" w:history="1">
+      <w:hyperlink w:anchor="_Toc220097981" w:history="1">
         <w:r>
           <w:rPr>
             <w:rStyle w:val="Hipervnculo"/>
@@ -1995,7 +1995,7 @@
             <w:noProof/>
             <w:webHidden/>
           </w:rPr>
-          <w:instrText xml:space="preserve"> PAGEREF _Toc219753876 \h </w:instrText>
+          <w:instrText xml:space="preserve"> PAGEREF _Toc220097981 \h </w:instrText>
         </w:r>
         <w:r>
           <w:rPr>
@@ -2015,7 +2015,7 @@
             <w:noProof/>
             <w:webHidden/>
           </w:rPr>
-          <w:t>11</w:t>
+          <w:t>12</w:t>
         </w:r>
         <w:r>
           <w:rPr>
@@ -2041,7 +2041,7 @@
           <w14:ligatures w14:val="standardContextual"/>
         </w:rPr>
       </w:pPr>
-      <w:hyperlink w:anchor="_Toc219753877" w:history="1">
+      <w:hyperlink w:anchor="_Toc220097982" w:history="1">
         <w:r>
           <w:rPr>
             <w:rStyle w:val="Hipervnculo"/>
@@ -2068,7 +2068,7 @@
             <w:noProof/>
             <w:webHidden/>
           </w:rPr>
-          <w:instrText xml:space="preserve"> PAGEREF _Toc219753877 \h </w:instrText>
+          <w:instrText xml:space="preserve"> PAGEREF _Toc220097982 \h </w:instrText>
         </w:r>
         <w:r>
           <w:rPr>
@@ -2088,7 +2088,7 @@
             <w:noProof/>
             <w:webHidden/>
           </w:rPr>
-          <w:t>11</w:t>
+          <w:t>12</w:t>
         </w:r>
         <w:r>
           <w:rPr>
@@ -2116,7 +2116,7 @@
           <w14:ligatures w14:val="standardContextual"/>
         </w:rPr>
       </w:pPr>
-      <w:hyperlink w:anchor="_Toc219753878" w:history="1">
+      <w:hyperlink w:anchor="_Toc220097983" w:history="1">
         <w:r>
           <w:rPr>
             <w:rStyle w:val="Hipervnculo"/>
@@ -2143,7 +2143,7 @@
             <w:noProof/>
             <w:webHidden/>
           </w:rPr>
-          <w:instrText xml:space="preserve"> PAGEREF _Toc219753878 \h </w:instrText>
+          <w:instrText xml:space="preserve"> PAGEREF _Toc220097983 \h </w:instrText>
         </w:r>
         <w:r>
           <w:rPr>
@@ -2163,7 +2163,7 @@
             <w:noProof/>
             <w:webHidden/>
           </w:rPr>
-          <w:t>12</w:t>
+          <w:t>13</w:t>
         </w:r>
         <w:r>
           <w:rPr>
@@ -2189,7 +2189,7 @@
           <w14:ligatures w14:val="standardContextual"/>
         </w:rPr>
       </w:pPr>
-      <w:hyperlink w:anchor="_Toc219753879" w:history="1">
+      <w:hyperlink w:anchor="_Toc220097984" w:history="1">
         <w:r>
           <w:rPr>
             <w:rStyle w:val="Hipervnculo"/>
@@ -2216,7 +2216,7 @@
             <w:noProof/>
             <w:webHidden/>
           </w:rPr>
-          <w:instrText xml:space="preserve"> PAGEREF _Toc219753879 \h </w:instrText>
+          <w:instrText xml:space="preserve"> PAGEREF _Toc220097984 \h </w:instrText>
         </w:r>
         <w:r>
           <w:rPr>
@@ -2236,7 +2236,7 @@
             <w:noProof/>
             <w:webHidden/>
           </w:rPr>
-          <w:t>12</w:t>
+          <w:t>13</w:t>
         </w:r>
         <w:r>
           <w:rPr>
@@ -2262,7 +2262,7 @@
           <w14:ligatures w14:val="standardContextual"/>
         </w:rPr>
       </w:pPr>
-      <w:hyperlink w:anchor="_Toc219753880" w:history="1">
+      <w:hyperlink w:anchor="_Toc220097985" w:history="1">
         <w:r>
           <w:rPr>
             <w:rStyle w:val="Hipervnculo"/>
@@ -2289,7 +2289,7 @@
             <w:noProof/>
             <w:webHidden/>
           </w:rPr>
-          <w:instrText xml:space="preserve"> PAGEREF _Toc219753880 \h </w:instrText>
+          <w:instrText xml:space="preserve"> PAGEREF _Toc220097985 \h </w:instrText>
         </w:r>
         <w:r>
           <w:rPr>
@@ -2309,7 +2309,7 @@
             <w:noProof/>
             <w:webHidden/>
           </w:rPr>
-          <w:t>12</w:t>
+          <w:t>13</w:t>
         </w:r>
         <w:r>
           <w:rPr>
@@ -2335,7 +2335,7 @@
           <w14:ligatures w14:val="standardContextual"/>
         </w:rPr>
       </w:pPr>
-      <w:hyperlink w:anchor="_Toc219753881" w:history="1">
+      <w:hyperlink w:anchor="_Toc220097986" w:history="1">
         <w:r>
           <w:rPr>
             <w:rStyle w:val="Hipervnculo"/>
@@ -2362,7 +2362,7 @@
             <w:noProof/>
             <w:webHidden/>
           </w:rPr>
-          <w:instrText xml:space="preserve"> PAGEREF _Toc219753881 \h </w:instrText>
+          <w:instrText xml:space="preserve"> PAGEREF _Toc220097986 \h </w:instrText>
         </w:r>
         <w:r>
           <w:rPr>
@@ -2382,7 +2382,7 @@
             <w:noProof/>
             <w:webHidden/>
           </w:rPr>
-          <w:t>12</w:t>
+          <w:t>13</w:t>
         </w:r>
         <w:r>
           <w:rPr>
@@ -2408,7 +2408,7 @@
           <w14:ligatures w14:val="standardContextual"/>
         </w:rPr>
       </w:pPr>
-      <w:hyperlink w:anchor="_Toc219753882" w:history="1">
+      <w:hyperlink w:anchor="_Toc220097987" w:history="1">
         <w:r>
           <w:rPr>
             <w:rStyle w:val="Hipervnculo"/>
@@ -2435,7 +2435,7 @@
             <w:noProof/>
             <w:webHidden/>
           </w:rPr>
-          <w:instrText xml:space="preserve"> PAGEREF _Toc219753882 \h </w:instrText>
+          <w:instrText xml:space="preserve"> PAGEREF _Toc220097987 \h </w:instrText>
         </w:r>
         <w:r>
           <w:rPr>
@@ -2455,7 +2455,7 @@
             <w:noProof/>
             <w:webHidden/>
           </w:rPr>
-          <w:t>12</w:t>
+          <w:t>13</w:t>
         </w:r>
         <w:r>
           <w:rPr>
@@ -2481,7 +2481,7 @@
           <w14:ligatures w14:val="standardContextual"/>
         </w:rPr>
       </w:pPr>
-      <w:hyperlink w:anchor="_Toc219753883" w:history="1">
+      <w:hyperlink w:anchor="_Toc220097988" w:history="1">
         <w:r>
           <w:rPr>
             <w:rStyle w:val="Hipervnculo"/>
@@ -2508,7 +2508,7 @@
             <w:noProof/>
             <w:webHidden/>
           </w:rPr>
-          <w:instrText xml:space="preserve"> PAGEREF _Toc219753883 \h </w:instrText>
+          <w:instrText xml:space="preserve"> PAGEREF _Toc220097988 \h </w:instrText>
         </w:r>
         <w:r>
           <w:rPr>
@@ -2528,7 +2528,7 @@
             <w:noProof/>
             <w:webHidden/>
           </w:rPr>
-          <w:t>12</w:t>
+          <w:t>13</w:t>
         </w:r>
         <w:r>
           <w:rPr>
@@ -2556,7 +2556,7 @@
           <w14:ligatures w14:val="standardContextual"/>
         </w:rPr>
       </w:pPr>
-      <w:hyperlink w:anchor="_Toc219753884" w:history="1">
+      <w:hyperlink w:anchor="_Toc220097989" w:history="1">
         <w:r>
           <w:rPr>
             <w:rStyle w:val="Hipervnculo"/>
@@ -2583,7 +2583,7 @@
             <w:noProof/>
             <w:webHidden/>
           </w:rPr>
-          <w:instrText xml:space="preserve"> PAGEREF _Toc219753884 \h </w:instrText>
+          <w:instrText xml:space="preserve"> PAGEREF _Toc220097989 \h </w:instrText>
         </w:r>
         <w:r>
           <w:rPr>
@@ -2603,7 +2603,7 @@
             <w:noProof/>
             <w:webHidden/>
           </w:rPr>
-          <w:t>13</w:t>
+          <w:t>14</w:t>
         </w:r>
         <w:r>
           <w:rPr>
@@ -2629,7 +2629,7 @@
           <w14:ligatures w14:val="standardContextual"/>
         </w:rPr>
       </w:pPr>
-      <w:hyperlink w:anchor="_Toc219753885" w:history="1">
+      <w:hyperlink w:anchor="_Toc220097990" w:history="1">
         <w:r>
           <w:rPr>
             <w:rStyle w:val="Hipervnculo"/>
@@ -2656,7 +2656,7 @@
             <w:noProof/>
             <w:webHidden/>
           </w:rPr>
-          <w:instrText xml:space="preserve"> PAGEREF _Toc219753885 \h </w:instrText>
+          <w:instrText xml:space="preserve"> PAGEREF _Toc220097990 \h </w:instrText>
         </w:r>
         <w:r>
           <w:rPr>
@@ -2676,7 +2676,7 @@
             <w:noProof/>
             <w:webHidden/>
           </w:rPr>
-          <w:t>13</w:t>
+          <w:t>14</w:t>
         </w:r>
         <w:r>
           <w:rPr>
@@ -2702,7 +2702,7 @@
           <w14:ligatures w14:val="standardContextual"/>
         </w:rPr>
       </w:pPr>
-      <w:hyperlink w:anchor="_Toc219753886" w:history="1">
+      <w:hyperlink w:anchor="_Toc220097991" w:history="1">
         <w:r>
           <w:rPr>
             <w:rStyle w:val="Hipervnculo"/>
@@ -2729,7 +2729,7 @@
             <w:noProof/>
             <w:webHidden/>
           </w:rPr>
-          <w:instrText xml:space="preserve"> PAGEREF _Toc219753886 \h </w:instrText>
+          <w:instrText xml:space="preserve"> PAGEREF _Toc220097991 \h </w:instrText>
         </w:r>
         <w:r>
           <w:rPr>
@@ -2749,7 +2749,7 @@
             <w:noProof/>
             <w:webHidden/>
           </w:rPr>
-          <w:t>13</w:t>
+          <w:t>14</w:t>
         </w:r>
         <w:r>
           <w:rPr>
@@ -2775,7 +2775,7 @@
           <w14:ligatures w14:val="standardContextual"/>
         </w:rPr>
       </w:pPr>
-      <w:hyperlink w:anchor="_Toc219753887" w:history="1">
+      <w:hyperlink w:anchor="_Toc220097992" w:history="1">
         <w:r>
           <w:rPr>
             <w:rStyle w:val="Hipervnculo"/>
@@ -2802,7 +2802,7 @@
             <w:noProof/>
             <w:webHidden/>
           </w:rPr>
-          <w:instrText xml:space="preserve"> PAGEREF _Toc219753887 \h </w:instrText>
+          <w:instrText xml:space="preserve"> PAGEREF _Toc220097992 \h </w:instrText>
         </w:r>
         <w:r>
           <w:rPr>
@@ -2822,7 +2822,7 @@
             <w:noProof/>
             <w:webHidden/>
           </w:rPr>
-          <w:t>13</w:t>
+          <w:t>14</w:t>
         </w:r>
         <w:r>
           <w:rPr>
@@ -2947,7 +2947,7 @@
           <w:rFonts w:asciiTheme="minorHAnsi" w:eastAsiaTheme="minorEastAsia" w:hAnsiTheme="minorHAnsi"/>
           <w:noProof/>
           <w:kern w:val="2"/>
-          <w:sz w:val="22"/>
+          <w:szCs w:val="24"/>
           <w:lang w:eastAsia="es-MX"/>
           <w14:ligatures w14:val="standardContextual"/>
         </w:rPr>
@@ -2961,7 +2961,7 @@
       <w:r>
         <w:fldChar w:fldCharType="separate"/>
       </w:r>
-      <w:hyperlink w:anchor="_Toc157799966" w:history="1">
+      <w:hyperlink w:anchor="_Toc220097993" w:history="1">
         <w:r>
           <w:rPr>
             <w:rStyle w:val="Hipervnculo"/>
@@ -2988,7 +2988,7 @@
             <w:noProof/>
             <w:webHidden/>
           </w:rPr>
-          <w:instrText xml:space="preserve"> PAGEREF _Toc157799966 \h </w:instrText>
+          <w:instrText xml:space="preserve"> PAGEREF _Toc220097993 \h </w:instrText>
         </w:r>
         <w:r>
           <w:rPr>
@@ -3087,7 +3087,7 @@
           <w:rFonts w:asciiTheme="minorHAnsi" w:eastAsiaTheme="minorEastAsia" w:hAnsiTheme="minorHAnsi"/>
           <w:noProof/>
           <w:kern w:val="2"/>
-          <w:sz w:val="22"/>
+          <w:szCs w:val="24"/>
           <w:lang w:eastAsia="es-MX"/>
           <w14:ligatures w14:val="standardContextual"/>
         </w:rPr>
@@ -3101,7 +3101,7 @@
       <w:r>
         <w:fldChar w:fldCharType="separate"/>
       </w:r>
-      <w:hyperlink w:anchor="_Toc157799967" w:history="1">
+      <w:hyperlink w:anchor="_Toc220097994" w:history="1">
         <w:r>
           <w:rPr>
             <w:rStyle w:val="Hipervnculo"/>
@@ -3128,7 +3128,7 @@
             <w:noProof/>
             <w:webHidden/>
           </w:rPr>
-          <w:instrText xml:space="preserve"> PAGEREF _Toc157799967 \h </w:instrText>
+          <w:instrText xml:space="preserve"> PAGEREF _Toc220097994 \h </w:instrText>
         </w:r>
         <w:r>
           <w:rPr>
@@ -3148,7 +3148,7 @@
             <w:noProof/>
             <w:webHidden/>
           </w:rPr>
-          <w:t>10</w:t>
+          <w:t>13</w:t>
         </w:r>
         <w:r>
           <w:rPr>
@@ -3380,7 +3380,7 @@
             <w:pPr>
               <w:pStyle w:val="Ttulo1"/>
             </w:pPr>
-            <w:bookmarkStart w:id="0" w:name="_Toc219753867"/>
+            <w:bookmarkStart w:id="0" w:name="_Toc220097972"/>
             <w:r>
               <w:lastRenderedPageBreak/>
               <w:t>DESCRIPCIÓN DEL PROYECTO</w:t>
@@ -3395,7 +3395,7 @@
       <w:pPr>
         <w:pStyle w:val="Ttulo2"/>
       </w:pPr>
-      <w:bookmarkStart w:id="1" w:name="_Toc219753868"/>
+      <w:bookmarkStart w:id="1" w:name="_Toc220097973"/>
       <w:r>
         <w:t>Datos generales de la empresa</w:t>
       </w:r>
@@ -3409,6 +3409,12 @@
       <w:r>
         <w:t>El Centro Nacional de Investigación y Desarrollo Tecnológico (Cenidet) fundado en enero de 1987, forma parte del Tecnológico Nacional de México (TecNM), la institución de educación superior tecnológica más grande de nuestro país.</w:t>
       </w:r>
+      <w:r>
+        <w:t xml:space="preserve"> </w:t>
+      </w:r>
+      <w:r>
+        <w:t>Cenidet es una institución que tiene como objetivo destacar como un centro de excelencia dentro del Sistema Nacional de Institutos Tecnológicos. Su misión es formar investigadores competitivos a nivel internacional que aporten soluciones tecnológicas, mediante prácticas responsables y éticas.</w:t>
+      </w:r>
     </w:p>
     <w:p>
       <w:pPr>
@@ -3420,292 +3426,7 @@
         <w:jc w:val="both"/>
       </w:pPr>
       <w:r>
-        <w:t>Cenidet es una institución que tiene como objetivo destacar como un centro de excelencia dentro del Sistema Nacional de Institutos Tecnológicos. Su misión es formar investigadores competitivos a nivel internacional que aporten soluciones tecnológicas, mediante prácticas responsables y éticas. Cenidet ofrece cinco programas de maestría en Ciencias:</w:t>
-      </w:r>
-    </w:p>
-    <w:p>
-      <w:pPr>
-        <w:jc w:val="both"/>
-      </w:pPr>
-    </w:p>
-    <w:p>
-      <w:pPr>
-        <w:pStyle w:val="Prrafodelista"/>
-        <w:numPr>
-          <w:ilvl w:val="0"/>
-          <w:numId w:val="25"/>
-        </w:numPr>
-        <w:jc w:val="both"/>
-      </w:pPr>
-      <w:r>
-        <w:t>De la Ingeniería (SNP-CONAHCYT).</w:t>
-      </w:r>
-    </w:p>
-    <w:p>
-      <w:pPr>
-        <w:pStyle w:val="Prrafodelista"/>
-        <w:numPr>
-          <w:ilvl w:val="0"/>
-          <w:numId w:val="25"/>
-        </w:numPr>
-        <w:jc w:val="both"/>
-      </w:pPr>
-      <w:r>
-        <w:t>En Ingeniería Mecánica (SNP-</w:t>
-      </w:r>
-      <w:r>
-        <w:t xml:space="preserve"> </w:t>
-      </w:r>
-      <w:r>
-        <w:t>CONAHCYT).</w:t>
-      </w:r>
-    </w:p>
-    <w:p>
-      <w:pPr>
-        <w:pStyle w:val="Prrafodelista"/>
-        <w:numPr>
-          <w:ilvl w:val="0"/>
-          <w:numId w:val="25"/>
-        </w:numPr>
-        <w:jc w:val="both"/>
-      </w:pPr>
-      <w:r>
-        <w:t>En Ingeniería Electrónica (SNP-</w:t>
-      </w:r>
-      <w:r>
-        <w:t xml:space="preserve"> </w:t>
-      </w:r>
-      <w:r>
-        <w:t>CONAHCYT</w:t>
-      </w:r>
-      <w:r>
-        <w:t>).</w:t>
-      </w:r>
-    </w:p>
-    <w:p>
-      <w:pPr>
-        <w:pStyle w:val="Prrafodelista"/>
-        <w:numPr>
-          <w:ilvl w:val="0"/>
-          <w:numId w:val="25"/>
-        </w:numPr>
-        <w:jc w:val="both"/>
-      </w:pPr>
-      <w:r>
-        <w:t>De la Computación (SNP-</w:t>
-      </w:r>
-      <w:r>
-        <w:t xml:space="preserve"> CONAHCYT</w:t>
-      </w:r>
-      <w:r>
-        <w:t>).</w:t>
-      </w:r>
-    </w:p>
-    <w:p>
-      <w:pPr>
-        <w:pStyle w:val="Prrafodelista"/>
-        <w:numPr>
-          <w:ilvl w:val="0"/>
-          <w:numId w:val="25"/>
-        </w:numPr>
-        <w:jc w:val="both"/>
-      </w:pPr>
-      <w:r>
-        <w:t>En Ingeniería Mecatrónica</w:t>
-      </w:r>
-      <w:r>
-        <w:t xml:space="preserve"> (SNP-CONAHCYT)</w:t>
-      </w:r>
-      <w:r>
-        <w:t>.</w:t>
-      </w:r>
-    </w:p>
-    <w:p>
-      <w:pPr>
-        <w:jc w:val="both"/>
-      </w:pPr>
-    </w:p>
-    <w:p>
-      <w:pPr>
-        <w:jc w:val="both"/>
-      </w:pPr>
-      <w:r>
-        <w:t>Asimismo, Cenidet creó una nueva maestría:</w:t>
-      </w:r>
-    </w:p>
-    <w:p>
-      <w:pPr>
-        <w:jc w:val="both"/>
-      </w:pPr>
-    </w:p>
-    <w:p>
-      <w:pPr>
-        <w:pStyle w:val="Prrafodelista"/>
-        <w:numPr>
-          <w:ilvl w:val="0"/>
-          <w:numId w:val="25"/>
-        </w:numPr>
-        <w:jc w:val="both"/>
-      </w:pPr>
-      <w:r>
-        <w:t>En Ingeniería.</w:t>
-      </w:r>
-    </w:p>
-    <w:p>
-      <w:pPr>
-        <w:jc w:val="both"/>
-      </w:pPr>
-    </w:p>
-    <w:p>
-      <w:pPr>
-        <w:jc w:val="both"/>
-      </w:pPr>
-      <w:r>
-        <w:t xml:space="preserve">Además, cuenta con </w:t>
-      </w:r>
-      <w:r>
-        <w:t>cinco</w:t>
-      </w:r>
-      <w:r>
-        <w:t xml:space="preserve"> programas de doctorados en Ciencias:</w:t>
-      </w:r>
-    </w:p>
-    <w:p>
-      <w:pPr>
-        <w:jc w:val="both"/>
-      </w:pPr>
-    </w:p>
-    <w:p>
-      <w:pPr>
-        <w:pStyle w:val="Prrafodelista"/>
-        <w:numPr>
-          <w:ilvl w:val="0"/>
-          <w:numId w:val="25"/>
-        </w:numPr>
-        <w:jc w:val="both"/>
-      </w:pPr>
-      <w:r>
-        <w:t>De la Ingeniería (SNP-CONAHCYT).</w:t>
-      </w:r>
-    </w:p>
-    <w:p>
-      <w:pPr>
-        <w:pStyle w:val="Prrafodelista"/>
-        <w:numPr>
-          <w:ilvl w:val="0"/>
-          <w:numId w:val="25"/>
-        </w:numPr>
-        <w:jc w:val="both"/>
-      </w:pPr>
-      <w:r>
-        <w:t>En Ingeniería Mecánica (SNP-</w:t>
-      </w:r>
-      <w:r>
-        <w:t xml:space="preserve"> CONAHCYT</w:t>
-      </w:r>
-      <w:r>
-        <w:t>).</w:t>
-      </w:r>
-    </w:p>
-    <w:p>
-      <w:pPr>
-        <w:pStyle w:val="Prrafodelista"/>
-        <w:numPr>
-          <w:ilvl w:val="0"/>
-          <w:numId w:val="25"/>
-        </w:numPr>
-        <w:jc w:val="both"/>
-      </w:pPr>
-      <w:r>
-        <w:t>En Ingeniería Electrónica (SNP-</w:t>
-      </w:r>
-      <w:r>
-        <w:t xml:space="preserve"> CONAHCYT</w:t>
-      </w:r>
-      <w:r>
-        <w:t>).</w:t>
-      </w:r>
-    </w:p>
-    <w:p>
-      <w:pPr>
-        <w:pStyle w:val="Prrafodelista"/>
-        <w:numPr>
-          <w:ilvl w:val="0"/>
-          <w:numId w:val="25"/>
-        </w:numPr>
-        <w:jc w:val="both"/>
-      </w:pPr>
-      <w:r>
-        <w:t>De la Computación (SNP-</w:t>
-      </w:r>
-      <w:r>
-        <w:t xml:space="preserve"> CONAHCYT</w:t>
-      </w:r>
-      <w:r>
-        <w:t>).</w:t>
-      </w:r>
-    </w:p>
-    <w:p>
-      <w:pPr>
-        <w:pStyle w:val="Prrafodelista"/>
-        <w:numPr>
-          <w:ilvl w:val="0"/>
-          <w:numId w:val="25"/>
-        </w:numPr>
-        <w:jc w:val="both"/>
-      </w:pPr>
-      <w:r>
-        <w:lastRenderedPageBreak/>
-        <w:t>En Ingeniería Mecatrónica.</w:t>
-      </w:r>
-    </w:p>
-    <w:p>
-      <w:pPr>
-        <w:jc w:val="both"/>
-      </w:pPr>
-    </w:p>
-    <w:p>
-      <w:pPr>
-        <w:jc w:val="both"/>
-      </w:pPr>
-      <w:r>
-        <w:t xml:space="preserve">Así como </w:t>
-      </w:r>
-      <w:r>
-        <w:t>dos</w:t>
-      </w:r>
-      <w:r>
-        <w:t xml:space="preserve"> diplomado</w:t>
-      </w:r>
-      <w:r>
-        <w:t>s</w:t>
-      </w:r>
-      <w:r>
-        <w:t xml:space="preserve"> en</w:t>
-      </w:r>
-      <w:r>
-        <w:t>:</w:t>
-      </w:r>
-      <w:r>
-        <w:t xml:space="preserve"> Energías Renovables y Eficiencia Energética</w:t>
-      </w:r>
-      <w:r>
-        <w:t>, y, Energía Sustentable para Electromovilidad</w:t>
-      </w:r>
-      <w:r>
-        <w:t>,</w:t>
-      </w:r>
-      <w:r>
-        <w:t xml:space="preserve"> esta última siendo agregada recientemente, </w:t>
-      </w:r>
-      <w:r>
-        <w:t>además de una especialidad en Semiconductores.</w:t>
-      </w:r>
-      <w:r>
-        <w:t xml:space="preserve"> </w:t>
-      </w:r>
-      <w:r>
-        <w:t xml:space="preserve"> La </w:t>
+        <w:t xml:space="preserve">La </w:t>
       </w:r>
       <w:r>
         <w:fldChar w:fldCharType="begin"/>
@@ -3814,7 +3535,7 @@
         <w:pStyle w:val="Descripcin"/>
       </w:pPr>
       <w:bookmarkStart w:id="2" w:name="_Ref219753137"/>
-      <w:bookmarkStart w:id="3" w:name="_Toc157799966"/>
+      <w:bookmarkStart w:id="3" w:name="_Toc220097993"/>
       <w:r>
         <w:t xml:space="preserve">Figura </w:t>
       </w:r>
@@ -3849,35 +3570,58 @@
         <w:jc w:val="both"/>
       </w:pPr>
       <w:r>
-        <w:t xml:space="preserve">El Cenidet se encuentra ubicado en el Interior Internado Palmira s/n Col. Palmira, Cuernavaca, Morelos C.P. 62490 a un lado del Instituto de Investigaciones Eléctricas (INEEL). Actualmente cuenta aproximadamente con un total de 123 empleados, los cuales están distribuidos en diferentes áreas: Oficina de Cómputo, Organización y Seguimiento de Estudios, Centro de Información, Comunicación y Eventos, Desarrollo Académico e Idiomas, Gestión Tecnológica y Vinculación, Planeación, Programación y Presupuestación, Recursos Humanos y Servicios Escolares. </w:t>
+        <w:t>El Cenidet se encuentra ubicado en el Interior Internado Palmira s/n Col. Palmira, Cuernavaca, Morelos C.P. 62490 a un lado del Instituto de Investigaciones Eléctricas (INEEL). Actualmente cuenta aproximadamente con un total de 123 empleados, los cuales están distribuidos en diferentes áreas: Oficina de Cómputo, Organización y Seguimiento de Estudios, Centro de Información, Comunicación y Eventos, Desarrollo Académico e Idiomas, Gestión Tecnológica y Vinculación, Planeación, Programación y Presupuestación, Recursos Humanos y Servicios Escolares, las cuales trabajan de manera coordinada para garantizar el funcionamiento de la institución, así como la atención eficiente a la comunidad estudiantil y docente.</w:t>
       </w:r>
     </w:p>
     <w:p>
       <w:pPr>
         <w:jc w:val="both"/>
       </w:pPr>
+      <w:r>
+        <w:lastRenderedPageBreak/>
+        <w:t xml:space="preserve">Este proyecto </w:t>
+      </w:r>
+      <w:r>
+        <w:t xml:space="preserve">estará bajo el mando y </w:t>
+      </w:r>
+      <w:r>
+        <w:t xml:space="preserve">a su vez </w:t>
+      </w:r>
+      <w:r>
+        <w:t xml:space="preserve">será supervisado por el Dr. Vitervo López Caballero, </w:t>
+      </w:r>
+      <w:r>
+        <w:t>qu</w:t>
+      </w:r>
+      <w:r>
+        <w:t>e</w:t>
+      </w:r>
+      <w:r>
+        <w:t xml:space="preserve"> </w:t>
+      </w:r>
+      <w:r>
+        <w:t>a</w:t>
+      </w:r>
+      <w:r>
+        <w:t>ctualmente desempeña el cargo de profesor investigador</w:t>
+      </w:r>
+      <w:r>
+        <w:t xml:space="preserve"> y</w:t>
+      </w:r>
+      <w:r>
+        <w:t xml:space="preserve"> se ha desempeñado como profesor por asignatura durante </w:t>
+      </w:r>
+      <w:r>
+        <w:t>ocho</w:t>
+      </w:r>
+      <w:r>
+        <w:t xml:space="preserve"> años consecutivos en la maestría en Tecnologías de la Información.</w:t>
+      </w:r>
     </w:p>
     <w:p>
       <w:pPr>
         <w:jc w:val="both"/>
       </w:pPr>
-      <w:r>
-        <w:t xml:space="preserve">Este proyecto será supervisado por el Dr. </w:t>
-      </w:r>
-      <w:proofErr w:type="spellStart"/>
-      <w:r>
-        <w:t>Vitervo</w:t>
-      </w:r>
-      <w:proofErr w:type="spellEnd"/>
-      <w:r>
-        <w:t xml:space="preserve"> López Caballero, egresado de Cenidet como Doctor en Ciencias de la Ingeniería con la especialidad en Ingeniería de Software, y cuenta con nivel SNI C. Actualmente desempeña el cargo de profesor investigador, se ha desempeñado como profesor por asignatura durante </w:t>
-      </w:r>
-      <w:r>
-        <w:t>ocho</w:t>
-      </w:r>
-      <w:r>
-        <w:t xml:space="preserve"> años consecutivos en la maestría en Tecnologías de la Información.</w:t>
-      </w:r>
     </w:p>
     <w:p>
       <w:pPr>
@@ -3886,8 +3630,28 @@
     </w:p>
     <w:p>
       <w:pPr>
+        <w:pStyle w:val="Ttulo2"/>
+      </w:pPr>
+      <w:bookmarkStart w:id="4" w:name="_Toc220097974"/>
+      <w:r>
+        <w:t>Antecedentes del proyecto</w:t>
+      </w:r>
+      <w:bookmarkEnd w:id="4"/>
+    </w:p>
+    <w:p/>
+    <w:p>
+      <w:pPr>
         <w:jc w:val="both"/>
       </w:pPr>
+      <w:r>
+        <w:t xml:space="preserve">Actualmente, el </w:t>
+      </w:r>
+      <w:r>
+        <w:t>Cenidet</w:t>
+      </w:r>
+      <w:r>
+        <w:t xml:space="preserve"> gestiona la información y los procesos administrativos de los estudiantes de maestría y doctorado mediante un sistema antiguo y desactualizado, el cual no responde adecuadamente a las necesidades actuales de la institución. Dicho sistema presenta diversas limitaciones, ya que la mayoría de los procedimientos son complejos, poco eficientes y dependen en gran medida de actividades manuales, lo que genera retrasos en los trámites, duplicidad de tareas, mayor probabilidad de errores y una alta carga administrativa para el personal involucrado.</w:t>
+      </w:r>
     </w:p>
     <w:p>
       <w:pPr>
@@ -3898,86 +3662,162 @@
       <w:pPr>
         <w:jc w:val="both"/>
       </w:pPr>
+      <w:r>
+        <w:t xml:space="preserve">Ante esta situación, el </w:t>
+      </w:r>
+      <w:r>
+        <w:t>Cenidet</w:t>
+      </w:r>
+      <w:r>
+        <w:t xml:space="preserve"> ha identificado la necesidad de implementar una solución que permita modernizar y automatizar los procesos relacionados con la administración de los estudiantes de posgrado, con el propósito de reducir el trabajo manual, optimizar los tiempos de respuesta y mejorar la eficiencia en la gestión académica y administrativa.</w:t>
+      </w:r>
+      <w:r>
+        <w:t xml:space="preserve"> </w:t>
+      </w:r>
+      <w:r>
+        <w:t>Además, se busca fortalecer el control y seguimiento de cada trámite, así como mejorar la disponibilidad y confiabilidad de la información para la toma de decisiones institucionales.</w:t>
+      </w:r>
+    </w:p>
+    <w:p>
+      <w:pPr>
+        <w:jc w:val="both"/>
+      </w:pPr>
+    </w:p>
+    <w:p>
+      <w:pPr>
+        <w:jc w:val="both"/>
+      </w:pPr>
+      <w:r>
+        <w:t xml:space="preserve"> </w:t>
+      </w:r>
     </w:p>
     <w:p>
       <w:pPr>
         <w:pStyle w:val="Ttulo2"/>
       </w:pPr>
-      <w:bookmarkStart w:id="4" w:name="_Toc219753869"/>
+      <w:bookmarkStart w:id="5" w:name="_Toc220097975"/>
+      <w:r>
+        <w:t>Objetivo general</w:t>
+      </w:r>
+      <w:bookmarkEnd w:id="5"/>
+    </w:p>
+    <w:p/>
+    <w:p>
+      <w:pPr>
+        <w:jc w:val="both"/>
+      </w:pPr>
+      <w:r>
+        <w:t xml:space="preserve">Optimizar y agilizar el proceso de inscripción, reinscripción y gestión de la información académica de los estudiantes de maestría y doctorado del </w:t>
+      </w:r>
+      <w:r>
+        <w:t>Cenidet</w:t>
+      </w:r>
+      <w:r>
+        <w:t>, mediante la integración y automatización de los procesos administrativos por roles, con el fin de reducir la carga manual, minimizar errores y mejorar la eficiencia operativa institucional.</w:t>
+      </w:r>
+    </w:p>
+    <w:p>
+      <w:pPr>
+        <w:pStyle w:val="Ttulo2"/>
+      </w:pPr>
+      <w:bookmarkStart w:id="6" w:name="_Toc220097976"/>
       <w:r>
         <w:lastRenderedPageBreak/>
-        <w:t>Antecedentes del proyecto</w:t>
-      </w:r>
-      <w:bookmarkEnd w:id="4"/>
+        <w:t>Objetivos específicos</w:t>
+      </w:r>
+      <w:bookmarkEnd w:id="6"/>
     </w:p>
     <w:p/>
     <w:p>
       <w:pPr>
+        <w:pStyle w:val="Prrafodelista"/>
+        <w:numPr>
+          <w:ilvl w:val="0"/>
+          <w:numId w:val="26"/>
+        </w:numPr>
         <w:jc w:val="both"/>
       </w:pPr>
       <w:r>
-        <w:t>Actualmente, el</w:t>
+        <w:t>Analizar y documentar los procesos actuales del Sistema Integral de Información (SII) relacionados con la inscripción, reinscripción y gestión académica del posgrado, con el fin de identificar áreas de oportunidad, cuellos de botella y actividades susceptibles de automatización.</w:t>
+      </w:r>
+    </w:p>
+    <w:p>
+      <w:pPr>
+        <w:pStyle w:val="Prrafodelista"/>
+        <w:numPr>
+          <w:ilvl w:val="0"/>
+          <w:numId w:val="26"/>
+        </w:numPr>
+        <w:jc w:val="both"/>
+      </w:pPr>
+      <w:r>
+        <w:t>Diseñar el modelo de datos y la arquitectura funcional del sistema, considerando los distintos roles institucionales (estudiante,</w:t>
       </w:r>
       <w:r>
         <w:t xml:space="preserve"> </w:t>
       </w:r>
       <w:r>
-        <w:t>Cenidet gestiona la información y los procesos administrativos de los estudiantes de maestría y doctorado mediante un sistema antiguo y desactualizado. Dicho sistema presenta diversas limitaciones, ya que la mayoría de los procedimientos son complejos, poco eficientes y dependen en gran medida de actividades manuales, lo que incrementa la carga administrativa y la probabilidad de errores en la gestión de la información.</w:t>
-      </w:r>
-    </w:p>
-    <w:p>
-      <w:pPr>
+        <w:t xml:space="preserve">control escolar, </w:t>
+      </w:r>
+      <w:r>
+        <w:t>profesor,</w:t>
+      </w:r>
+      <w:r>
+        <w:t xml:space="preserve"> servicios escolares, finanzas, </w:t>
+      </w:r>
+      <w:r>
+        <w:t>coordinador</w:t>
+      </w:r>
+      <w:r>
+        <w:t xml:space="preserve"> y administrador)</w:t>
+      </w:r>
+      <w:r>
+        <w:t>.</w:t>
+      </w:r>
+    </w:p>
+    <w:p>
+      <w:pPr>
+        <w:pStyle w:val="Prrafodelista"/>
+        <w:numPr>
+          <w:ilvl w:val="0"/>
+          <w:numId w:val="26"/>
+        </w:numPr>
         <w:jc w:val="both"/>
       </w:pPr>
-    </w:p>
-    <w:p>
-      <w:pPr>
+      <w:r>
+        <w:t xml:space="preserve">Implementar los módulos principales del sistema que permitan automatizar los procesos de inscripción, reinscripción, pagos, carga académica, control escolar y gestión de usuarios, conforme a las reglas académicas del </w:t>
+      </w:r>
+      <w:r>
+        <w:t>Cenidet</w:t>
+      </w:r>
+      <w:r>
+        <w:t>.</w:t>
+      </w:r>
+    </w:p>
+    <w:p>
+      <w:pPr>
+        <w:pStyle w:val="Prrafodelista"/>
+        <w:numPr>
+          <w:ilvl w:val="0"/>
+          <w:numId w:val="26"/>
+        </w:numPr>
         <w:jc w:val="both"/>
       </w:pPr>
       <w:r>
-        <w:t>Ante esta situación, Cenidet ha identificado la necesidad de desarrollar una solución de software que permita modernizar y automatizar los procesos relacionados con la administración de los estudiantes de posgrado, con el propósito de reducir el trabajo manual, optimizar los tiempos de respuesta y mejorar la eficiencia en la gestión académica y administrativa.</w:t>
-      </w:r>
-    </w:p>
-    <w:p>
-      <w:pPr>
-        <w:jc w:val="both"/>
-      </w:pPr>
-      <w:r>
-        <w:t xml:space="preserve"> </w:t>
-      </w:r>
-    </w:p>
-    <w:p>
-      <w:pPr>
-        <w:pStyle w:val="Ttulo2"/>
-      </w:pPr>
-      <w:bookmarkStart w:id="5" w:name="_Toc219753870"/>
-      <w:r>
-        <w:t>Objetivo general</w:t>
-      </w:r>
-      <w:bookmarkEnd w:id="5"/>
-    </w:p>
-    <w:p/>
-    <w:p>
-      <w:pPr>
-        <w:jc w:val="both"/>
-      </w:pPr>
-      <w:r>
-        <w:t>Desarrollar e implementar un sistema de aplicación web que permita modernizar y automatizar la gestión de los procesos administrativos de los estudiantes de maestría y doctorado en el Cenidet</w:t>
-      </w:r>
-      <w:r>
-        <w:t>.</w:t>
-      </w:r>
-    </w:p>
-    <w:p/>
-    <w:p>
-      <w:pPr>
-        <w:pStyle w:val="Ttulo2"/>
-      </w:pPr>
-      <w:bookmarkStart w:id="6" w:name="_Toc219753871"/>
-      <w:r>
-        <w:t>Objetivos específicos</w:t>
-      </w:r>
-      <w:bookmarkEnd w:id="6"/>
+        <w:t>Integrar mecanismos de validación y control</w:t>
+      </w:r>
+      <w:r>
+        <w:t xml:space="preserve"> por etapas,</w:t>
+      </w:r>
+      <w:r>
+        <w:t xml:space="preserve"> que reduzcan errores</w:t>
+      </w:r>
+      <w:r>
+        <w:t xml:space="preserve"> humanos</w:t>
+      </w:r>
+      <w:r>
+        <w:t xml:space="preserve"> y tiempos de operación.</w:t>
+      </w:r>
     </w:p>
     <w:p/>
     <w:p/>
@@ -3985,7 +3825,7 @@
       <w:pPr>
         <w:pStyle w:val="Ttulo2"/>
       </w:pPr>
-      <w:bookmarkStart w:id="7" w:name="_Toc219753872"/>
+      <w:bookmarkStart w:id="7" w:name="_Toc220097977"/>
       <w:r>
         <w:t>Justificación</w:t>
       </w:r>
@@ -3997,19 +3837,60 @@
         <w:jc w:val="both"/>
       </w:pPr>
       <w:r>
-        <w:t>La implementación de un sistema automatizado para modernizar los procesos administrativos del Cenidet es necesaria para agilizar la gestión de la información de los estudiantes de maestría y doctorado y reducir la carga de trabajo asociada a los procedimientos manuales que actualmente se realizan. El uso de un sistema antiguo y desactualizado ha provocado que muchos procesos sean complejos, lentos y propensos a errores, lo que impacta negativamente en la eficiencia operativa de la institución.</w:t>
-      </w:r>
-    </w:p>
-    <w:p/>
-    <w:p>
-      <w:pPr>
-        <w:pStyle w:val="Ttulo2"/>
-      </w:pPr>
-      <w:bookmarkStart w:id="8" w:name="_Toc219753873"/>
-      <w:r>
-        <w:t>Alcances</w:t>
-      </w:r>
-      <w:bookmarkEnd w:id="8"/>
+        <w:t>Actualmente, en el C</w:t>
+      </w:r>
+      <w:r>
+        <w:t>enidet</w:t>
+      </w:r>
+      <w:r>
+        <w:t xml:space="preserve"> diversos procesos relacionados con la gestión de estudiantes de maestría y doctorado se realizan de forma manual o mediante un sistema antiguo, tales como el registro y validación de inscripciones y reinscripciones, la revisión de pagos, el control de documentación, la asignación de cargas académicas, la captura de calificaciones y la generación de reportes administrativos. Estos procedimientos implican un alto consumo de tiempo, duplicidad de tareas, dependencia directa del personal administrativo y una mayor probabilidad de errores en la gestión de la información.</w:t>
+      </w:r>
+    </w:p>
+    <w:p>
+      <w:pPr>
+        <w:jc w:val="both"/>
+      </w:pPr>
+    </w:p>
+    <w:p>
+      <w:pPr>
+        <w:jc w:val="both"/>
+      </w:pPr>
+      <w:r>
+        <w:t>Esta situación provoca retrasos en los trámites, saturación de trabajo en periodos críticos y dificultades para dar seguimiento oportuno a cada proceso, afectando tanto al personal administrativo como a los estudiantes de posgrado</w:t>
+      </w:r>
+      <w:r>
+        <w:t>, lo que se traduce en una menor eficiencia institucional,</w:t>
+      </w:r>
+      <w:r>
+        <w:t xml:space="preserve"> inconformidades por parte de los usuarios </w:t>
+      </w:r>
+      <w:r>
+        <w:t>y una limitada capacidad</w:t>
+      </w:r>
+      <w:r>
+        <w:t xml:space="preserve"> de </w:t>
+      </w:r>
+      <w:r>
+        <w:t>respuesta</w:t>
+      </w:r>
+      <w:r>
+        <w:t>.</w:t>
+      </w:r>
+    </w:p>
+    <w:p>
+      <w:pPr>
+        <w:jc w:val="both"/>
+      </w:pPr>
+      <w:r>
+        <w:lastRenderedPageBreak/>
+        <w:t xml:space="preserve">Por lo anterior, resulta necesario implementar un sistema web que permita integrar y automatizar dichos procesos, facilitando el acceso a la información en tiempo real, el control por roles y la trazabilidad de cada trámite. Con el desarrollo de este sistema web, el </w:t>
+      </w:r>
+      <w:r>
+        <w:t>Cenidet</w:t>
+      </w:r>
+      <w:r>
+        <w:t xml:space="preserve"> podrá reducir significativamente la carga de trabajo manual, minimizar errores humanos, optimizar los tiempos de atención y mejorar la eficiencia operativa institucional, beneficiando tanto a la comunidad estudiantil como al personal académico y administrativo.</w:t>
+      </w:r>
     </w:p>
     <w:p/>
     <w:p/>
@@ -4017,7 +3898,85 @@
       <w:pPr>
         <w:pStyle w:val="Ttulo2"/>
       </w:pPr>
-      <w:bookmarkStart w:id="9" w:name="_Toc219753874"/>
+      <w:bookmarkStart w:id="8" w:name="_Toc220097978"/>
+      <w:r>
+        <w:t>Alcances</w:t>
+      </w:r>
+      <w:bookmarkEnd w:id="8"/>
+    </w:p>
+    <w:p/>
+    <w:p>
+      <w:r>
+        <w:t>El proyecto contempla:</w:t>
+      </w:r>
+    </w:p>
+    <w:p>
+      <w:pPr>
+        <w:pStyle w:val="Prrafodelista"/>
+        <w:numPr>
+          <w:ilvl w:val="0"/>
+          <w:numId w:val="27"/>
+        </w:numPr>
+        <w:jc w:val="both"/>
+      </w:pPr>
+      <w:r>
+        <w:t>La automatización de los procesos de inscripción, reinscripción, pagos, carga académica y control de información académica.</w:t>
+      </w:r>
+    </w:p>
+    <w:p>
+      <w:pPr>
+        <w:pStyle w:val="Prrafodelista"/>
+        <w:numPr>
+          <w:ilvl w:val="0"/>
+          <w:numId w:val="27"/>
+        </w:numPr>
+        <w:jc w:val="both"/>
+      </w:pPr>
+      <w:r>
+        <w:t>La implementación de control de acceso por roles para los distintos actores institucionales.</w:t>
+      </w:r>
+    </w:p>
+    <w:p>
+      <w:pPr>
+        <w:pStyle w:val="Prrafodelista"/>
+        <w:numPr>
+          <w:ilvl w:val="0"/>
+          <w:numId w:val="27"/>
+        </w:numPr>
+        <w:jc w:val="both"/>
+      </w:pPr>
+      <w:r>
+        <w:t>La generación de reportes básicos y documentos digitales relacionados con la gestión académica.</w:t>
+      </w:r>
+    </w:p>
+    <w:p>
+      <w:pPr>
+        <w:jc w:val="both"/>
+      </w:pPr>
+      <w:r>
+        <w:t>El proyecto no contempla:</w:t>
+      </w:r>
+    </w:p>
+    <w:p>
+      <w:pPr>
+        <w:pStyle w:val="Prrafodelista"/>
+        <w:numPr>
+          <w:ilvl w:val="0"/>
+          <w:numId w:val="27"/>
+        </w:numPr>
+        <w:jc w:val="both"/>
+      </w:pPr>
+      <w:r>
+        <w:t>La elaboración de manual de usuario.</w:t>
+      </w:r>
+    </w:p>
+    <w:p/>
+    <w:p/>
+    <w:p>
+      <w:pPr>
+        <w:pStyle w:val="Ttulo2"/>
+      </w:pPr>
+      <w:bookmarkStart w:id="9" w:name="_Toc220097979"/>
       <w:r>
         <w:t>Restricciones</w:t>
       </w:r>
@@ -4047,23 +4006,13 @@
         <w:jc w:val="both"/>
       </w:pPr>
       <w:r>
-        <w:t xml:space="preserve">El desarrollo de la aplicación web se realizará utilizando el conjunto de herramientas </w:t>
-      </w:r>
-      <w:proofErr w:type="spellStart"/>
-      <w:r>
-        <w:t>stack</w:t>
-      </w:r>
-      <w:proofErr w:type="spellEnd"/>
-      <w:r>
-        <w:t xml:space="preserve"> VILT, Vue.js, Inertia.js, Laravel, </w:t>
-      </w:r>
-      <w:proofErr w:type="spellStart"/>
-      <w:r>
-        <w:t>Tailwind</w:t>
-      </w:r>
-      <w:proofErr w:type="spellEnd"/>
-      <w:r>
-        <w:t xml:space="preserve"> y CSS, por lo que el desarrollo sólo considerará estas tecnologías para el entorno de producción. </w:t>
+        <w:t xml:space="preserve">El desarrollo del </w:t>
+      </w:r>
+      <w:r>
+        <w:t>sistema</w:t>
+      </w:r>
+      <w:r>
+        <w:t xml:space="preserve"> web se realizará utilizando el conjunto de herramientas stack VILT, Vue.js, Inertia.js, Laravel, Tailwind y CSS, por lo que el desarrollo sólo considerará estas tecnologías para el entorno de producción. </w:t>
       </w:r>
     </w:p>
     <w:p>
@@ -4084,7 +4033,13 @@
         </w:sectPr>
       </w:pPr>
       <w:r>
-        <w:t>Solo los usuarios autorizados podrán acceder a ciertas funcionalidades de la aplicación web, según su rol.</w:t>
+        <w:t xml:space="preserve">Solo los usuarios autorizados podrán acceder a ciertas funcionalidades del </w:t>
+      </w:r>
+      <w:r>
+        <w:t>sistema</w:t>
+      </w:r>
+      <w:r>
+        <w:t xml:space="preserve"> web, según su rol.</w:t>
       </w:r>
     </w:p>
     <w:tbl>
@@ -4117,7 +4072,7 @@
             <w:pPr>
               <w:pStyle w:val="Ttulo1"/>
             </w:pPr>
-            <w:bookmarkStart w:id="10" w:name="_Toc219753875"/>
+            <w:bookmarkStart w:id="10" w:name="_Toc220097980"/>
             <w:r>
               <w:lastRenderedPageBreak/>
               <w:t xml:space="preserve">MARCO </w:t>
@@ -4135,7 +4090,7 @@
       <w:pPr>
         <w:pStyle w:val="Ttulo2"/>
       </w:pPr>
-      <w:bookmarkStart w:id="11" w:name="_Toc219753876"/>
+      <w:bookmarkStart w:id="11" w:name="_Toc220097981"/>
       <w:r>
         <w:t>Principios teóricos</w:t>
       </w:r>
@@ -4150,7 +4105,7 @@
       <w:pPr>
         <w:pStyle w:val="Ttulo2"/>
       </w:pPr>
-      <w:bookmarkStart w:id="12" w:name="_Toc219753877"/>
+      <w:bookmarkStart w:id="12" w:name="_Toc220097982"/>
       <w:r>
         <w:t>P</w:t>
       </w:r>
@@ -4202,7 +4157,7 @@
             <w:pPr>
               <w:pStyle w:val="Ttulo1"/>
             </w:pPr>
-            <w:bookmarkStart w:id="13" w:name="_Toc219753878"/>
+            <w:bookmarkStart w:id="13" w:name="_Toc220097983"/>
             <w:r>
               <w:lastRenderedPageBreak/>
               <w:t>DESARROLLO</w:t>
@@ -4217,7 +4172,7 @@
       <w:pPr>
         <w:pStyle w:val="Ttulo2"/>
       </w:pPr>
-      <w:bookmarkStart w:id="14" w:name="_Toc219753879"/>
+      <w:bookmarkStart w:id="14" w:name="_Toc220097984"/>
       <w:r>
         <w:t>Inicio</w:t>
       </w:r>
@@ -4228,7 +4183,7 @@
       <w:pPr>
         <w:pStyle w:val="Descripcin"/>
       </w:pPr>
-      <w:bookmarkStart w:id="15" w:name="_Toc157799967"/>
+      <w:bookmarkStart w:id="15" w:name="_Toc220097994"/>
       <w:r>
         <w:t xml:space="preserve">Tabla </w:t>
       </w:r>
@@ -4449,15 +4404,7 @@
               <w:jc w:val="center"/>
             </w:pPr>
             <w:r>
-              <w:t xml:space="preserve">Dr. </w:t>
-            </w:r>
-            <w:proofErr w:type="spellStart"/>
-            <w:r>
-              <w:t>Vitervo</w:t>
-            </w:r>
-            <w:proofErr w:type="spellEnd"/>
-            <w:r>
-              <w:t xml:space="preserve"> López Caballero</w:t>
+              <w:t>Dr. Vitervo López Caballero</w:t>
             </w:r>
           </w:p>
         </w:tc>
@@ -4588,7 +4535,7 @@
       <w:pPr>
         <w:pStyle w:val="Ttulo2"/>
       </w:pPr>
-      <w:bookmarkStart w:id="16" w:name="_Toc219753880"/>
+      <w:bookmarkStart w:id="16" w:name="_Toc220097985"/>
       <w:r>
         <w:t>Planeación</w:t>
       </w:r>
@@ -4600,7 +4547,7 @@
       <w:pPr>
         <w:pStyle w:val="Ttulo2"/>
       </w:pPr>
-      <w:bookmarkStart w:id="17" w:name="_Toc219753881"/>
+      <w:bookmarkStart w:id="17" w:name="_Toc220097986"/>
       <w:r>
         <w:t>Ejecución</w:t>
       </w:r>
@@ -4612,7 +4559,7 @@
       <w:pPr>
         <w:pStyle w:val="Ttulo2"/>
       </w:pPr>
-      <w:bookmarkStart w:id="18" w:name="_Toc219753882"/>
+      <w:bookmarkStart w:id="18" w:name="_Toc220097987"/>
       <w:r>
         <w:t>Control</w:t>
       </w:r>
@@ -4624,7 +4571,7 @@
       <w:pPr>
         <w:pStyle w:val="Ttulo2"/>
       </w:pPr>
-      <w:bookmarkStart w:id="19" w:name="_Toc219753883"/>
+      <w:bookmarkStart w:id="19" w:name="_Toc220097988"/>
       <w:r>
         <w:t>Cierre</w:t>
       </w:r>
@@ -4672,7 +4619,7 @@
             <w:pPr>
               <w:pStyle w:val="Ttulo1"/>
             </w:pPr>
-            <w:bookmarkStart w:id="20" w:name="_Toc219753884"/>
+            <w:bookmarkStart w:id="20" w:name="_Toc220097989"/>
             <w:r>
               <w:lastRenderedPageBreak/>
               <w:t>CONCLUSIONES</w:t>
@@ -4687,7 +4634,7 @@
       <w:pPr>
         <w:pStyle w:val="Ttulo2"/>
       </w:pPr>
-      <w:bookmarkStart w:id="21" w:name="_Toc219753885"/>
+      <w:bookmarkStart w:id="21" w:name="_Toc220097990"/>
       <w:r>
         <w:t>Cumplimiento de objetivos</w:t>
       </w:r>
@@ -4699,7 +4646,7 @@
       <w:pPr>
         <w:pStyle w:val="Ttulo2"/>
       </w:pPr>
-      <w:bookmarkStart w:id="22" w:name="_Toc219753886"/>
+      <w:bookmarkStart w:id="22" w:name="_Toc220097991"/>
       <w:r>
         <w:t>Resultados</w:t>
       </w:r>
@@ -4711,7 +4658,7 @@
       <w:pPr>
         <w:pStyle w:val="Ttulo2"/>
       </w:pPr>
-      <w:bookmarkStart w:id="23" w:name="_Toc219753887"/>
+      <w:bookmarkStart w:id="23" w:name="_Toc220097992"/>
       <w:r>
         <w:t>Contribuciones</w:t>
       </w:r>
@@ -6148,6 +6095,119 @@
     </w:lvl>
   </w:abstractNum>
   <w:abstractNum w:abstractNumId="7" w15:restartNumberingAfterBreak="0">
+    <w:nsid w:val="310670C7"/>
+    <w:multiLevelType w:val="hybridMultilevel"/>
+    <w:tmpl w:val="A680FE28"/>
+    <w:lvl w:ilvl="0" w:tplc="080A0001">
+      <w:start w:val="1"/>
+      <w:numFmt w:val="bullet"/>
+      <w:lvlText w:val=""/>
+      <w:lvlJc w:val="left"/>
+      <w:pPr>
+        <w:ind w:left="720" w:hanging="360"/>
+      </w:pPr>
+      <w:rPr>
+        <w:rFonts w:ascii="Symbol" w:hAnsi="Symbol" w:hint="default"/>
+      </w:rPr>
+    </w:lvl>
+    <w:lvl w:ilvl="1" w:tplc="080A0003" w:tentative="1">
+      <w:start w:val="1"/>
+      <w:numFmt w:val="bullet"/>
+      <w:lvlText w:val="o"/>
+      <w:lvlJc w:val="left"/>
+      <w:pPr>
+        <w:ind w:left="1440" w:hanging="360"/>
+      </w:pPr>
+      <w:rPr>
+        <w:rFonts w:ascii="Courier New" w:hAnsi="Courier New" w:cs="Courier New" w:hint="default"/>
+      </w:rPr>
+    </w:lvl>
+    <w:lvl w:ilvl="2" w:tplc="080A0005" w:tentative="1">
+      <w:start w:val="1"/>
+      <w:numFmt w:val="bullet"/>
+      <w:lvlText w:val=""/>
+      <w:lvlJc w:val="left"/>
+      <w:pPr>
+        <w:ind w:left="2160" w:hanging="360"/>
+      </w:pPr>
+      <w:rPr>
+        <w:rFonts w:ascii="Wingdings" w:hAnsi="Wingdings" w:hint="default"/>
+      </w:rPr>
+    </w:lvl>
+    <w:lvl w:ilvl="3" w:tplc="080A0001" w:tentative="1">
+      <w:start w:val="1"/>
+      <w:numFmt w:val="bullet"/>
+      <w:lvlText w:val=""/>
+      <w:lvlJc w:val="left"/>
+      <w:pPr>
+        <w:ind w:left="2880" w:hanging="360"/>
+      </w:pPr>
+      <w:rPr>
+        <w:rFonts w:ascii="Symbol" w:hAnsi="Symbol" w:hint="default"/>
+      </w:rPr>
+    </w:lvl>
+    <w:lvl w:ilvl="4" w:tplc="080A0003" w:tentative="1">
+      <w:start w:val="1"/>
+      <w:numFmt w:val="bullet"/>
+      <w:lvlText w:val="o"/>
+      <w:lvlJc w:val="left"/>
+      <w:pPr>
+        <w:ind w:left="3600" w:hanging="360"/>
+      </w:pPr>
+      <w:rPr>
+        <w:rFonts w:ascii="Courier New" w:hAnsi="Courier New" w:cs="Courier New" w:hint="default"/>
+      </w:rPr>
+    </w:lvl>
+    <w:lvl w:ilvl="5" w:tplc="080A0005" w:tentative="1">
+      <w:start w:val="1"/>
+      <w:numFmt w:val="bullet"/>
+      <w:lvlText w:val=""/>
+      <w:lvlJc w:val="left"/>
+      <w:pPr>
+        <w:ind w:left="4320" w:hanging="360"/>
+      </w:pPr>
+      <w:rPr>
+        <w:rFonts w:ascii="Wingdings" w:hAnsi="Wingdings" w:hint="default"/>
+      </w:rPr>
+    </w:lvl>
+    <w:lvl w:ilvl="6" w:tplc="080A0001" w:tentative="1">
+      <w:start w:val="1"/>
+      <w:numFmt w:val="bullet"/>
+      <w:lvlText w:val=""/>
+      <w:lvlJc w:val="left"/>
+      <w:pPr>
+        <w:ind w:left="5040" w:hanging="360"/>
+      </w:pPr>
+      <w:rPr>
+        <w:rFonts w:ascii="Symbol" w:hAnsi="Symbol" w:hint="default"/>
+      </w:rPr>
+    </w:lvl>
+    <w:lvl w:ilvl="7" w:tplc="080A0003" w:tentative="1">
+      <w:start w:val="1"/>
+      <w:numFmt w:val="bullet"/>
+      <w:lvlText w:val="o"/>
+      <w:lvlJc w:val="left"/>
+      <w:pPr>
+        <w:ind w:left="5760" w:hanging="360"/>
+      </w:pPr>
+      <w:rPr>
+        <w:rFonts w:ascii="Courier New" w:hAnsi="Courier New" w:cs="Courier New" w:hint="default"/>
+      </w:rPr>
+    </w:lvl>
+    <w:lvl w:ilvl="8" w:tplc="080A0005" w:tentative="1">
+      <w:start w:val="1"/>
+      <w:numFmt w:val="bullet"/>
+      <w:lvlText w:val=""/>
+      <w:lvlJc w:val="left"/>
+      <w:pPr>
+        <w:ind w:left="6480" w:hanging="360"/>
+      </w:pPr>
+      <w:rPr>
+        <w:rFonts w:ascii="Wingdings" w:hAnsi="Wingdings" w:hint="default"/>
+      </w:rPr>
+    </w:lvl>
+  </w:abstractNum>
+  <w:abstractNum w:abstractNumId="8" w15:restartNumberingAfterBreak="0">
     <w:nsid w:val="3702131F"/>
     <w:multiLevelType w:val="multilevel"/>
     <w:tmpl w:val="79124C8E"/>
@@ -6266,7 +6326,120 @@
       </w:rPr>
     </w:lvl>
   </w:abstractNum>
-  <w:abstractNum w:abstractNumId="8" w15:restartNumberingAfterBreak="0">
+  <w:abstractNum w:abstractNumId="9" w15:restartNumberingAfterBreak="0">
+    <w:nsid w:val="43D32E54"/>
+    <w:multiLevelType w:val="hybridMultilevel"/>
+    <w:tmpl w:val="0EC4BD2A"/>
+    <w:lvl w:ilvl="0" w:tplc="080A0001">
+      <w:start w:val="1"/>
+      <w:numFmt w:val="bullet"/>
+      <w:lvlText w:val=""/>
+      <w:lvlJc w:val="left"/>
+      <w:pPr>
+        <w:ind w:left="720" w:hanging="360"/>
+      </w:pPr>
+      <w:rPr>
+        <w:rFonts w:ascii="Symbol" w:hAnsi="Symbol" w:hint="default"/>
+      </w:rPr>
+    </w:lvl>
+    <w:lvl w:ilvl="1" w:tplc="080A0003" w:tentative="1">
+      <w:start w:val="1"/>
+      <w:numFmt w:val="bullet"/>
+      <w:lvlText w:val="o"/>
+      <w:lvlJc w:val="left"/>
+      <w:pPr>
+        <w:ind w:left="1440" w:hanging="360"/>
+      </w:pPr>
+      <w:rPr>
+        <w:rFonts w:ascii="Courier New" w:hAnsi="Courier New" w:cs="Courier New" w:hint="default"/>
+      </w:rPr>
+    </w:lvl>
+    <w:lvl w:ilvl="2" w:tplc="080A0005" w:tentative="1">
+      <w:start w:val="1"/>
+      <w:numFmt w:val="bullet"/>
+      <w:lvlText w:val=""/>
+      <w:lvlJc w:val="left"/>
+      <w:pPr>
+        <w:ind w:left="2160" w:hanging="360"/>
+      </w:pPr>
+      <w:rPr>
+        <w:rFonts w:ascii="Wingdings" w:hAnsi="Wingdings" w:hint="default"/>
+      </w:rPr>
+    </w:lvl>
+    <w:lvl w:ilvl="3" w:tplc="080A0001" w:tentative="1">
+      <w:start w:val="1"/>
+      <w:numFmt w:val="bullet"/>
+      <w:lvlText w:val=""/>
+      <w:lvlJc w:val="left"/>
+      <w:pPr>
+        <w:ind w:left="2880" w:hanging="360"/>
+      </w:pPr>
+      <w:rPr>
+        <w:rFonts w:ascii="Symbol" w:hAnsi="Symbol" w:hint="default"/>
+      </w:rPr>
+    </w:lvl>
+    <w:lvl w:ilvl="4" w:tplc="080A0003" w:tentative="1">
+      <w:start w:val="1"/>
+      <w:numFmt w:val="bullet"/>
+      <w:lvlText w:val="o"/>
+      <w:lvlJc w:val="left"/>
+      <w:pPr>
+        <w:ind w:left="3600" w:hanging="360"/>
+      </w:pPr>
+      <w:rPr>
+        <w:rFonts w:ascii="Courier New" w:hAnsi="Courier New" w:cs="Courier New" w:hint="default"/>
+      </w:rPr>
+    </w:lvl>
+    <w:lvl w:ilvl="5" w:tplc="080A0005" w:tentative="1">
+      <w:start w:val="1"/>
+      <w:numFmt w:val="bullet"/>
+      <w:lvlText w:val=""/>
+      <w:lvlJc w:val="left"/>
+      <w:pPr>
+        <w:ind w:left="4320" w:hanging="360"/>
+      </w:pPr>
+      <w:rPr>
+        <w:rFonts w:ascii="Wingdings" w:hAnsi="Wingdings" w:hint="default"/>
+      </w:rPr>
+    </w:lvl>
+    <w:lvl w:ilvl="6" w:tplc="080A0001" w:tentative="1">
+      <w:start w:val="1"/>
+      <w:numFmt w:val="bullet"/>
+      <w:lvlText w:val=""/>
+      <w:lvlJc w:val="left"/>
+      <w:pPr>
+        <w:ind w:left="5040" w:hanging="360"/>
+      </w:pPr>
+      <w:rPr>
+        <w:rFonts w:ascii="Symbol" w:hAnsi="Symbol" w:hint="default"/>
+      </w:rPr>
+    </w:lvl>
+    <w:lvl w:ilvl="7" w:tplc="080A0003" w:tentative="1">
+      <w:start w:val="1"/>
+      <w:numFmt w:val="bullet"/>
+      <w:lvlText w:val="o"/>
+      <w:lvlJc w:val="left"/>
+      <w:pPr>
+        <w:ind w:left="5760" w:hanging="360"/>
+      </w:pPr>
+      <w:rPr>
+        <w:rFonts w:ascii="Courier New" w:hAnsi="Courier New" w:cs="Courier New" w:hint="default"/>
+      </w:rPr>
+    </w:lvl>
+    <w:lvl w:ilvl="8" w:tplc="080A0005" w:tentative="1">
+      <w:start w:val="1"/>
+      <w:numFmt w:val="bullet"/>
+      <w:lvlText w:val=""/>
+      <w:lvlJc w:val="left"/>
+      <w:pPr>
+        <w:ind w:left="6480" w:hanging="360"/>
+      </w:pPr>
+      <w:rPr>
+        <w:rFonts w:ascii="Wingdings" w:hAnsi="Wingdings" w:hint="default"/>
+      </w:rPr>
+    </w:lvl>
+  </w:abstractNum>
+  <w:abstractNum w:abstractNumId="10" w15:restartNumberingAfterBreak="0">
     <w:nsid w:val="473036B8"/>
     <w:multiLevelType w:val="hybridMultilevel"/>
     <w:tmpl w:val="ED625D0C"/>
@@ -6379,7 +6552,7 @@
       </w:rPr>
     </w:lvl>
   </w:abstractNum>
-  <w:abstractNum w:abstractNumId="9" w15:restartNumberingAfterBreak="0">
+  <w:abstractNum w:abstractNumId="11" w15:restartNumberingAfterBreak="0">
     <w:nsid w:val="4978426D"/>
     <w:multiLevelType w:val="hybridMultilevel"/>
     <w:tmpl w:val="3828C2E6"/>
@@ -6492,7 +6665,7 @@
       </w:rPr>
     </w:lvl>
   </w:abstractNum>
-  <w:abstractNum w:abstractNumId="10" w15:restartNumberingAfterBreak="0">
+  <w:abstractNum w:abstractNumId="12" w15:restartNumberingAfterBreak="0">
     <w:nsid w:val="4C551EBA"/>
     <w:multiLevelType w:val="hybridMultilevel"/>
     <w:tmpl w:val="FDDEF326"/>
@@ -6605,7 +6778,7 @@
       </w:rPr>
     </w:lvl>
   </w:abstractNum>
-  <w:abstractNum w:abstractNumId="11" w15:restartNumberingAfterBreak="0">
+  <w:abstractNum w:abstractNumId="13" w15:restartNumberingAfterBreak="0">
     <w:nsid w:val="540C27A6"/>
     <w:multiLevelType w:val="hybridMultilevel"/>
     <w:tmpl w:val="A8A8C8C6"/>
@@ -6718,7 +6891,7 @@
       </w:rPr>
     </w:lvl>
   </w:abstractNum>
-  <w:abstractNum w:abstractNumId="12" w15:restartNumberingAfterBreak="0">
+  <w:abstractNum w:abstractNumId="14" w15:restartNumberingAfterBreak="0">
     <w:nsid w:val="57EA798E"/>
     <w:multiLevelType w:val="hybridMultilevel"/>
     <w:tmpl w:val="134A7AAC"/>
@@ -6831,7 +7004,7 @@
       </w:rPr>
     </w:lvl>
   </w:abstractNum>
-  <w:abstractNum w:abstractNumId="13" w15:restartNumberingAfterBreak="0">
+  <w:abstractNum w:abstractNumId="15" w15:restartNumberingAfterBreak="0">
     <w:nsid w:val="60835B45"/>
     <w:multiLevelType w:val="hybridMultilevel"/>
     <w:tmpl w:val="7D745DEA"/>
@@ -6944,7 +7117,7 @@
       </w:rPr>
     </w:lvl>
   </w:abstractNum>
-  <w:abstractNum w:abstractNumId="14" w15:restartNumberingAfterBreak="0">
+  <w:abstractNum w:abstractNumId="16" w15:restartNumberingAfterBreak="0">
     <w:nsid w:val="68A25361"/>
     <w:multiLevelType w:val="hybridMultilevel"/>
     <w:tmpl w:val="058AD1E0"/>
@@ -7057,7 +7230,7 @@
       </w:rPr>
     </w:lvl>
   </w:abstractNum>
-  <w:abstractNum w:abstractNumId="15" w15:restartNumberingAfterBreak="0">
+  <w:abstractNum w:abstractNumId="17" w15:restartNumberingAfterBreak="0">
     <w:nsid w:val="700D738A"/>
     <w:multiLevelType w:val="hybridMultilevel"/>
     <w:tmpl w:val="88768084"/>
@@ -7170,7 +7343,7 @@
       </w:rPr>
     </w:lvl>
   </w:abstractNum>
-  <w:abstractNum w:abstractNumId="16" w15:restartNumberingAfterBreak="0">
+  <w:abstractNum w:abstractNumId="18" w15:restartNumberingAfterBreak="0">
     <w:nsid w:val="735C5A2E"/>
     <w:multiLevelType w:val="hybridMultilevel"/>
     <w:tmpl w:val="D67AA9DA"/>
@@ -7283,7 +7456,7 @@
       </w:rPr>
     </w:lvl>
   </w:abstractNum>
-  <w:abstractNum w:abstractNumId="17" w15:restartNumberingAfterBreak="0">
+  <w:abstractNum w:abstractNumId="19" w15:restartNumberingAfterBreak="0">
     <w:nsid w:val="771C43E1"/>
     <w:multiLevelType w:val="hybridMultilevel"/>
     <w:tmpl w:val="06C87EA0"/>
@@ -7395,7 +7568,7 @@
       </w:rPr>
     </w:lvl>
   </w:abstractNum>
-  <w:abstractNum w:abstractNumId="18" w15:restartNumberingAfterBreak="0">
+  <w:abstractNum w:abstractNumId="20" w15:restartNumberingAfterBreak="0">
     <w:nsid w:val="7C4C332A"/>
     <w:multiLevelType w:val="multilevel"/>
     <w:tmpl w:val="080A001D"/>
@@ -7481,7 +7654,7 @@
       </w:pPr>
     </w:lvl>
   </w:abstractNum>
-  <w:abstractNum w:abstractNumId="19" w15:restartNumberingAfterBreak="0">
+  <w:abstractNum w:abstractNumId="21" w15:restartNumberingAfterBreak="0">
     <w:nsid w:val="7FDD1C8E"/>
     <w:multiLevelType w:val="hybridMultilevel"/>
     <w:tmpl w:val="61F0BD26"/>
@@ -7568,10 +7741,10 @@
     </w:lvl>
   </w:abstractNum>
   <w:num w:numId="1" w16cid:durableId="30612225">
-    <w:abstractNumId w:val="18"/>
+    <w:abstractNumId w:val="20"/>
   </w:num>
   <w:num w:numId="2" w16cid:durableId="1553270190">
-    <w:abstractNumId w:val="18"/>
+    <w:abstractNumId w:val="20"/>
     <w:lvlOverride w:ilvl="0">
       <w:startOverride w:val="1"/>
     </w:lvlOverride>
@@ -7601,25 +7774,25 @@
     </w:lvlOverride>
   </w:num>
   <w:num w:numId="3" w16cid:durableId="1807117518">
-    <w:abstractNumId w:val="7"/>
+    <w:abstractNumId w:val="8"/>
   </w:num>
   <w:num w:numId="4" w16cid:durableId="1703019987">
-    <w:abstractNumId w:val="14"/>
+    <w:abstractNumId w:val="16"/>
   </w:num>
   <w:num w:numId="5" w16cid:durableId="444690292">
-    <w:abstractNumId w:val="7"/>
+    <w:abstractNumId w:val="8"/>
   </w:num>
   <w:num w:numId="6" w16cid:durableId="2030714286">
-    <w:abstractNumId w:val="7"/>
+    <w:abstractNumId w:val="8"/>
   </w:num>
   <w:num w:numId="7" w16cid:durableId="1277056726">
-    <w:abstractNumId w:val="7"/>
+    <w:abstractNumId w:val="8"/>
   </w:num>
   <w:num w:numId="8" w16cid:durableId="591665600">
-    <w:abstractNumId w:val="7"/>
+    <w:abstractNumId w:val="8"/>
   </w:num>
   <w:num w:numId="9" w16cid:durableId="157157229">
-    <w:abstractNumId w:val="10"/>
+    <w:abstractNumId w:val="12"/>
   </w:num>
   <w:num w:numId="10" w16cid:durableId="1964462179">
     <w:abstractNumId w:val="5"/>
@@ -7634,40 +7807,46 @@
     <w:abstractNumId w:val="1"/>
   </w:num>
   <w:num w:numId="14" w16cid:durableId="1149443383">
-    <w:abstractNumId w:val="19"/>
+    <w:abstractNumId w:val="21"/>
   </w:num>
   <w:num w:numId="15" w16cid:durableId="1672950422">
-    <w:abstractNumId w:val="8"/>
+    <w:abstractNumId w:val="10"/>
   </w:num>
   <w:num w:numId="16" w16cid:durableId="270236878">
-    <w:abstractNumId w:val="9"/>
+    <w:abstractNumId w:val="11"/>
   </w:num>
   <w:num w:numId="17" w16cid:durableId="1542279737">
-    <w:abstractNumId w:val="16"/>
+    <w:abstractNumId w:val="18"/>
   </w:num>
   <w:num w:numId="18" w16cid:durableId="115415542">
-    <w:abstractNumId w:val="12"/>
+    <w:abstractNumId w:val="14"/>
   </w:num>
   <w:num w:numId="19" w16cid:durableId="23799179">
-    <w:abstractNumId w:val="11"/>
+    <w:abstractNumId w:val="13"/>
   </w:num>
   <w:num w:numId="20" w16cid:durableId="1130711442">
     <w:abstractNumId w:val="4"/>
   </w:num>
   <w:num w:numId="21" w16cid:durableId="1232930714">
-    <w:abstractNumId w:val="13"/>
+    <w:abstractNumId w:val="15"/>
   </w:num>
   <w:num w:numId="22" w16cid:durableId="1349911112">
     <w:abstractNumId w:val="6"/>
   </w:num>
   <w:num w:numId="23" w16cid:durableId="641345834">
-    <w:abstractNumId w:val="15"/>
+    <w:abstractNumId w:val="17"/>
   </w:num>
   <w:num w:numId="24" w16cid:durableId="1466655733">
     <w:abstractNumId w:val="0"/>
   </w:num>
   <w:num w:numId="25" w16cid:durableId="1027370790">
-    <w:abstractNumId w:val="17"/>
+    <w:abstractNumId w:val="19"/>
+  </w:num>
+  <w:num w:numId="26" w16cid:durableId="563489325">
+    <w:abstractNumId w:val="9"/>
+  </w:num>
+  <w:num w:numId="27" w16cid:durableId="68044545">
+    <w:abstractNumId w:val="7"/>
   </w:num>
 </w:numbering>
 </file>

</xml_diff>